<commit_message>
docs: just updated that latest docx article
</commit_message>
<xml_diff>
--- a/docs/article/gost_article_vak.docx
+++ b/docs/article/gost_article_vak.docx
@@ -1783,6 +1783,682 @@
     </w:p>
     <w:p>
       <w:pPr>
+        <w:spacing w:after="0" w:before="0" w:line="360"/>
+        <w:ind w:firstLine="709"/>
+        <w:jc w:val="both"/>
+      </w:pPr>
+      <w:r>
+        <w:rPr>
+          <w:rFonts w:ascii="Times New Roman" w:cs="Times New Roman" w:eastAsia="Times New Roman" w:hAnsi="Times New Roman"/>
+          <w:sz w:val="28"/>
+          <w:szCs w:val="28"/>
+        </w:rPr>
+        <w:t xml:space="preserve">На рисунках 1–5 представлены примеры наилучших результатов метода YOLOv8 (IoU &gt; 0,95): зелёный прямоугольник — эталонная разметка, красный — результат YOLOv8, синий — результат OpenCV.</w:t>
+      </w:r>
+    </w:p>
+    <w:p>
+      <w:pPr>
+        <w:spacing w:after="0" w:before="0" w:line="360"/>
+      </w:pPr>
+      <w:r>
+        <w:rPr>
+          <w:rFonts w:ascii="Times New Roman" w:cs="Times New Roman" w:eastAsia="Times New Roman" w:hAnsi="Times New Roman"/>
+          <w:sz w:val="28"/>
+          <w:szCs w:val="28"/>
+        </w:rPr>
+        <w:t xml:space="preserve"/>
+      </w:r>
+    </w:p>
+    <w:tbl>
+      <w:tblPr>
+        <w:tblW w:type="dxa" w:w="9355"/>
+        <w:tblBorders>
+          <w:top w:val="single" w:color="auto" w:sz="4"/>
+          <w:left w:val="single" w:color="auto" w:sz="4"/>
+          <w:bottom w:val="single" w:color="auto" w:sz="4"/>
+          <w:right w:val="single" w:color="auto" w:sz="4"/>
+          <w:insideH w:val="single" w:color="auto" w:sz="4"/>
+          <w:insideV w:val="single" w:color="auto" w:sz="4"/>
+        </w:tblBorders>
+      </w:tblPr>
+      <w:tblGrid>
+        <w:gridCol w:w="9355"/>
+      </w:tblGrid>
+      <w:tr>
+        <w:trPr>
+          <w:trHeight w:val="4320" w:hRule="exact"/>
+        </w:trPr>
+        <w:tc>
+          <w:tcPr>
+            <w:tcW w:type="dxa" w:w="9355"/>
+            <w:tcBorders>
+              <w:top w:val="single" w:color="888888" w:sz="6"/>
+              <w:left w:val="single" w:color="888888" w:sz="6"/>
+              <w:bottom w:val="single" w:color="888888" w:sz="6"/>
+              <w:right w:val="single" w:color="888888" w:sz="6"/>
+            </w:tcBorders>
+            <w:shd w:fill="F2F2F2" w:val="clear"/>
+            <w:vAlign w:val="center"/>
+          </w:tcPr>
+          <w:p>
+            <w:pPr>
+              <w:jc w:val="center"/>
+            </w:pPr>
+            <w:r>
+              <w:rPr>
+                <w:rFonts w:ascii="Times New Roman" w:cs="Times New Roman" w:eastAsia="Times New Roman" w:hAnsi="Times New Roman"/>
+                <w:i/>
+                <w:iCs/>
+                <w:color w:val="888888"/>
+                <w:sz w:val="24"/>
+                <w:szCs w:val="24"/>
+              </w:rPr>
+              <w:t xml:space="preserve">[ Рисунок — вставить изображение ]</w:t>
+            </w:r>
+          </w:p>
+        </w:tc>
+      </w:tr>
+    </w:tbl>
+    <w:p>
+      <w:pPr>
+        <w:spacing w:after="160" w:before="80" w:line="360"/>
+        <w:jc w:val="center"/>
+      </w:pPr>
+      <w:r>
+        <w:rPr>
+          <w:rFonts w:ascii="Times New Roman" w:cs="Times New Roman" w:eastAsia="Times New Roman" w:hAnsi="Times New Roman"/>
+          <w:i/>
+          <w:iCs/>
+          <w:sz w:val="28"/>
+          <w:szCs w:val="28"/>
+        </w:rPr>
+        <w:t xml:space="preserve">Рисунок 1 — Пример успешной детекции YOLOv8, тест 10 (IoU &gt; 0,95)</w:t>
+      </w:r>
+    </w:p>
+    <w:tbl>
+      <w:tblPr>
+        <w:tblW w:type="dxa" w:w="9355"/>
+        <w:tblBorders>
+          <w:top w:val="single" w:color="auto" w:sz="4"/>
+          <w:left w:val="single" w:color="auto" w:sz="4"/>
+          <w:bottom w:val="single" w:color="auto" w:sz="4"/>
+          <w:right w:val="single" w:color="auto" w:sz="4"/>
+          <w:insideH w:val="single" w:color="auto" w:sz="4"/>
+          <w:insideV w:val="single" w:color="auto" w:sz="4"/>
+        </w:tblBorders>
+      </w:tblPr>
+      <w:tblGrid>
+        <w:gridCol w:w="9355"/>
+      </w:tblGrid>
+      <w:tr>
+        <w:trPr>
+          <w:trHeight w:val="4320" w:hRule="exact"/>
+        </w:trPr>
+        <w:tc>
+          <w:tcPr>
+            <w:tcW w:type="dxa" w:w="9355"/>
+            <w:tcBorders>
+              <w:top w:val="single" w:color="888888" w:sz="6"/>
+              <w:left w:val="single" w:color="888888" w:sz="6"/>
+              <w:bottom w:val="single" w:color="888888" w:sz="6"/>
+              <w:right w:val="single" w:color="888888" w:sz="6"/>
+            </w:tcBorders>
+            <w:shd w:fill="F2F2F2" w:val="clear"/>
+            <w:vAlign w:val="center"/>
+          </w:tcPr>
+          <w:p>
+            <w:pPr>
+              <w:jc w:val="center"/>
+            </w:pPr>
+            <w:r>
+              <w:rPr>
+                <w:rFonts w:ascii="Times New Roman" w:cs="Times New Roman" w:eastAsia="Times New Roman" w:hAnsi="Times New Roman"/>
+                <w:i/>
+                <w:iCs/>
+                <w:color w:val="888888"/>
+                <w:sz w:val="24"/>
+                <w:szCs w:val="24"/>
+              </w:rPr>
+              <w:t xml:space="preserve">[ Рисунок — вставить изображение ]</w:t>
+            </w:r>
+          </w:p>
+        </w:tc>
+      </w:tr>
+    </w:tbl>
+    <w:p>
+      <w:pPr>
+        <w:spacing w:after="160" w:before="80" w:line="360"/>
+        <w:jc w:val="center"/>
+      </w:pPr>
+      <w:r>
+        <w:rPr>
+          <w:rFonts w:ascii="Times New Roman" w:cs="Times New Roman" w:eastAsia="Times New Roman" w:hAnsi="Times New Roman"/>
+          <w:i/>
+          <w:iCs/>
+          <w:sz w:val="28"/>
+          <w:szCs w:val="28"/>
+        </w:rPr>
+        <w:t xml:space="preserve">Рисунок 2 — Пример успешной детекции YOLOv8, тест 11 (IoU &gt; 0,95)</w:t>
+      </w:r>
+    </w:p>
+    <w:tbl>
+      <w:tblPr>
+        <w:tblW w:type="dxa" w:w="9355"/>
+        <w:tblBorders>
+          <w:top w:val="single" w:color="auto" w:sz="4"/>
+          <w:left w:val="single" w:color="auto" w:sz="4"/>
+          <w:bottom w:val="single" w:color="auto" w:sz="4"/>
+          <w:right w:val="single" w:color="auto" w:sz="4"/>
+          <w:insideH w:val="single" w:color="auto" w:sz="4"/>
+          <w:insideV w:val="single" w:color="auto" w:sz="4"/>
+        </w:tblBorders>
+      </w:tblPr>
+      <w:tblGrid>
+        <w:gridCol w:w="9355"/>
+      </w:tblGrid>
+      <w:tr>
+        <w:trPr>
+          <w:trHeight w:val="4320" w:hRule="exact"/>
+        </w:trPr>
+        <w:tc>
+          <w:tcPr>
+            <w:tcW w:type="dxa" w:w="9355"/>
+            <w:tcBorders>
+              <w:top w:val="single" w:color="888888" w:sz="6"/>
+              <w:left w:val="single" w:color="888888" w:sz="6"/>
+              <w:bottom w:val="single" w:color="888888" w:sz="6"/>
+              <w:right w:val="single" w:color="888888" w:sz="6"/>
+            </w:tcBorders>
+            <w:shd w:fill="F2F2F2" w:val="clear"/>
+            <w:vAlign w:val="center"/>
+          </w:tcPr>
+          <w:p>
+            <w:pPr>
+              <w:jc w:val="center"/>
+            </w:pPr>
+            <w:r>
+              <w:rPr>
+                <w:rFonts w:ascii="Times New Roman" w:cs="Times New Roman" w:eastAsia="Times New Roman" w:hAnsi="Times New Roman"/>
+                <w:i/>
+                <w:iCs/>
+                <w:color w:val="888888"/>
+                <w:sz w:val="24"/>
+                <w:szCs w:val="24"/>
+              </w:rPr>
+              <w:t xml:space="preserve">[ Рисунок — вставить изображение ]</w:t>
+            </w:r>
+          </w:p>
+        </w:tc>
+      </w:tr>
+    </w:tbl>
+    <w:p>
+      <w:pPr>
+        <w:spacing w:after="160" w:before="80" w:line="360"/>
+        <w:jc w:val="center"/>
+      </w:pPr>
+      <w:r>
+        <w:rPr>
+          <w:rFonts w:ascii="Times New Roman" w:cs="Times New Roman" w:eastAsia="Times New Roman" w:hAnsi="Times New Roman"/>
+          <w:i/>
+          <w:iCs/>
+          <w:sz w:val="28"/>
+          <w:szCs w:val="28"/>
+        </w:rPr>
+        <w:t xml:space="preserve">Рисунок 3 — Пример успешной детекции YOLOv8, тест 13 (IoU &gt; 0,95)</w:t>
+      </w:r>
+    </w:p>
+    <w:tbl>
+      <w:tblPr>
+        <w:tblW w:type="dxa" w:w="9355"/>
+        <w:tblBorders>
+          <w:top w:val="single" w:color="auto" w:sz="4"/>
+          <w:left w:val="single" w:color="auto" w:sz="4"/>
+          <w:bottom w:val="single" w:color="auto" w:sz="4"/>
+          <w:right w:val="single" w:color="auto" w:sz="4"/>
+          <w:insideH w:val="single" w:color="auto" w:sz="4"/>
+          <w:insideV w:val="single" w:color="auto" w:sz="4"/>
+        </w:tblBorders>
+      </w:tblPr>
+      <w:tblGrid>
+        <w:gridCol w:w="9355"/>
+      </w:tblGrid>
+      <w:tr>
+        <w:trPr>
+          <w:trHeight w:val="4320" w:hRule="exact"/>
+        </w:trPr>
+        <w:tc>
+          <w:tcPr>
+            <w:tcW w:type="dxa" w:w="9355"/>
+            <w:tcBorders>
+              <w:top w:val="single" w:color="888888" w:sz="6"/>
+              <w:left w:val="single" w:color="888888" w:sz="6"/>
+              <w:bottom w:val="single" w:color="888888" w:sz="6"/>
+              <w:right w:val="single" w:color="888888" w:sz="6"/>
+            </w:tcBorders>
+            <w:shd w:fill="F2F2F2" w:val="clear"/>
+            <w:vAlign w:val="center"/>
+          </w:tcPr>
+          <w:p>
+            <w:pPr>
+              <w:jc w:val="center"/>
+            </w:pPr>
+            <w:r>
+              <w:rPr>
+                <w:rFonts w:ascii="Times New Roman" w:cs="Times New Roman" w:eastAsia="Times New Roman" w:hAnsi="Times New Roman"/>
+                <w:i/>
+                <w:iCs/>
+                <w:color w:val="888888"/>
+                <w:sz w:val="24"/>
+                <w:szCs w:val="24"/>
+              </w:rPr>
+              <w:t xml:space="preserve">[ Рисунок — вставить изображение ]</w:t>
+            </w:r>
+          </w:p>
+        </w:tc>
+      </w:tr>
+    </w:tbl>
+    <w:p>
+      <w:pPr>
+        <w:spacing w:after="160" w:before="80" w:line="360"/>
+        <w:jc w:val="center"/>
+      </w:pPr>
+      <w:r>
+        <w:rPr>
+          <w:rFonts w:ascii="Times New Roman" w:cs="Times New Roman" w:eastAsia="Times New Roman" w:hAnsi="Times New Roman"/>
+          <w:i/>
+          <w:iCs/>
+          <w:sz w:val="28"/>
+          <w:szCs w:val="28"/>
+        </w:rPr>
+        <w:t xml:space="preserve">Рисунок 4 — Пример успешной детекции YOLOv8, тест 15 (IoU &gt; 0,95)</w:t>
+      </w:r>
+    </w:p>
+    <w:tbl>
+      <w:tblPr>
+        <w:tblW w:type="dxa" w:w="9355"/>
+        <w:tblBorders>
+          <w:top w:val="single" w:color="auto" w:sz="4"/>
+          <w:left w:val="single" w:color="auto" w:sz="4"/>
+          <w:bottom w:val="single" w:color="auto" w:sz="4"/>
+          <w:right w:val="single" w:color="auto" w:sz="4"/>
+          <w:insideH w:val="single" w:color="auto" w:sz="4"/>
+          <w:insideV w:val="single" w:color="auto" w:sz="4"/>
+        </w:tblBorders>
+      </w:tblPr>
+      <w:tblGrid>
+        <w:gridCol w:w="9355"/>
+      </w:tblGrid>
+      <w:tr>
+        <w:trPr>
+          <w:trHeight w:val="4320" w:hRule="exact"/>
+        </w:trPr>
+        <w:tc>
+          <w:tcPr>
+            <w:tcW w:type="dxa" w:w="9355"/>
+            <w:tcBorders>
+              <w:top w:val="single" w:color="888888" w:sz="6"/>
+              <w:left w:val="single" w:color="888888" w:sz="6"/>
+              <w:bottom w:val="single" w:color="888888" w:sz="6"/>
+              <w:right w:val="single" w:color="888888" w:sz="6"/>
+            </w:tcBorders>
+            <w:shd w:fill="F2F2F2" w:val="clear"/>
+            <w:vAlign w:val="center"/>
+          </w:tcPr>
+          <w:p>
+            <w:pPr>
+              <w:jc w:val="center"/>
+            </w:pPr>
+            <w:r>
+              <w:rPr>
+                <w:rFonts w:ascii="Times New Roman" w:cs="Times New Roman" w:eastAsia="Times New Roman" w:hAnsi="Times New Roman"/>
+                <w:i/>
+                <w:iCs/>
+                <w:color w:val="888888"/>
+                <w:sz w:val="24"/>
+                <w:szCs w:val="24"/>
+              </w:rPr>
+              <w:t xml:space="preserve">[ Рисунок — вставить изображение ]</w:t>
+            </w:r>
+          </w:p>
+        </w:tc>
+      </w:tr>
+    </w:tbl>
+    <w:p>
+      <w:pPr>
+        <w:spacing w:after="160" w:before="80" w:line="360"/>
+        <w:jc w:val="center"/>
+      </w:pPr>
+      <w:r>
+        <w:rPr>
+          <w:rFonts w:ascii="Times New Roman" w:cs="Times New Roman" w:eastAsia="Times New Roman" w:hAnsi="Times New Roman"/>
+          <w:i/>
+          <w:iCs/>
+          <w:sz w:val="28"/>
+          <w:szCs w:val="28"/>
+        </w:rPr>
+        <w:t xml:space="preserve">Рисунок 5 — Пример успешной детекции YOLOv8, тест 37 (IoU &gt; 0,95)</w:t>
+      </w:r>
+    </w:p>
+    <w:p>
+      <w:pPr>
+        <w:spacing w:after="0" w:before="0" w:line="360"/>
+      </w:pPr>
+      <w:r>
+        <w:rPr>
+          <w:rFonts w:ascii="Times New Roman" w:cs="Times New Roman" w:eastAsia="Times New Roman" w:hAnsi="Times New Roman"/>
+          <w:sz w:val="28"/>
+          <w:szCs w:val="28"/>
+        </w:rPr>
+        <w:t xml:space="preserve"/>
+      </w:r>
+    </w:p>
+    <w:p>
+      <w:pPr>
+        <w:spacing w:after="0" w:before="0" w:line="360"/>
+        <w:ind w:firstLine="709"/>
+        <w:jc w:val="both"/>
+      </w:pPr>
+      <w:r>
+        <w:rPr>
+          <w:rFonts w:ascii="Times New Roman" w:cs="Times New Roman" w:eastAsia="Times New Roman" w:hAnsi="Times New Roman"/>
+          <w:sz w:val="28"/>
+          <w:szCs w:val="28"/>
+        </w:rPr>
+        <w:t xml:space="preserve">На рисунках 6–10 представлены примеры наилучших результатов метода OpenCV (IoU &gt; 0,98).</w:t>
+      </w:r>
+    </w:p>
+    <w:p>
+      <w:pPr>
+        <w:spacing w:after="0" w:before="0" w:line="360"/>
+      </w:pPr>
+      <w:r>
+        <w:rPr>
+          <w:rFonts w:ascii="Times New Roman" w:cs="Times New Roman" w:eastAsia="Times New Roman" w:hAnsi="Times New Roman"/>
+          <w:sz w:val="28"/>
+          <w:szCs w:val="28"/>
+        </w:rPr>
+        <w:t xml:space="preserve"/>
+      </w:r>
+    </w:p>
+    <w:tbl>
+      <w:tblPr>
+        <w:tblW w:type="dxa" w:w="9355"/>
+        <w:tblBorders>
+          <w:top w:val="single" w:color="auto" w:sz="4"/>
+          <w:left w:val="single" w:color="auto" w:sz="4"/>
+          <w:bottom w:val="single" w:color="auto" w:sz="4"/>
+          <w:right w:val="single" w:color="auto" w:sz="4"/>
+          <w:insideH w:val="single" w:color="auto" w:sz="4"/>
+          <w:insideV w:val="single" w:color="auto" w:sz="4"/>
+        </w:tblBorders>
+      </w:tblPr>
+      <w:tblGrid>
+        <w:gridCol w:w="9355"/>
+      </w:tblGrid>
+      <w:tr>
+        <w:trPr>
+          <w:trHeight w:val="4320" w:hRule="exact"/>
+        </w:trPr>
+        <w:tc>
+          <w:tcPr>
+            <w:tcW w:type="dxa" w:w="9355"/>
+            <w:tcBorders>
+              <w:top w:val="single" w:color="888888" w:sz="6"/>
+              <w:left w:val="single" w:color="888888" w:sz="6"/>
+              <w:bottom w:val="single" w:color="888888" w:sz="6"/>
+              <w:right w:val="single" w:color="888888" w:sz="6"/>
+            </w:tcBorders>
+            <w:shd w:fill="F2F2F2" w:val="clear"/>
+            <w:vAlign w:val="center"/>
+          </w:tcPr>
+          <w:p>
+            <w:pPr>
+              <w:jc w:val="center"/>
+            </w:pPr>
+            <w:r>
+              <w:rPr>
+                <w:rFonts w:ascii="Times New Roman" w:cs="Times New Roman" w:eastAsia="Times New Roman" w:hAnsi="Times New Roman"/>
+                <w:i/>
+                <w:iCs/>
+                <w:color w:val="888888"/>
+                <w:sz w:val="24"/>
+                <w:szCs w:val="24"/>
+              </w:rPr>
+              <w:t xml:space="preserve">[ Рисунок — вставить изображение ]</w:t>
+            </w:r>
+          </w:p>
+        </w:tc>
+      </w:tr>
+    </w:tbl>
+    <w:p>
+      <w:pPr>
+        <w:spacing w:after="160" w:before="80" w:line="360"/>
+        <w:jc w:val="center"/>
+      </w:pPr>
+      <w:r>
+        <w:rPr>
+          <w:rFonts w:ascii="Times New Roman" w:cs="Times New Roman" w:eastAsia="Times New Roman" w:hAnsi="Times New Roman"/>
+          <w:i/>
+          <w:iCs/>
+          <w:sz w:val="28"/>
+          <w:szCs w:val="28"/>
+        </w:rPr>
+        <w:t xml:space="preserve">Рисунок 6 — Пример успешной локализации OpenCV, тест 17 (IoU &gt; 0,98)</w:t>
+      </w:r>
+    </w:p>
+    <w:tbl>
+      <w:tblPr>
+        <w:tblW w:type="dxa" w:w="9355"/>
+        <w:tblBorders>
+          <w:top w:val="single" w:color="auto" w:sz="4"/>
+          <w:left w:val="single" w:color="auto" w:sz="4"/>
+          <w:bottom w:val="single" w:color="auto" w:sz="4"/>
+          <w:right w:val="single" w:color="auto" w:sz="4"/>
+          <w:insideH w:val="single" w:color="auto" w:sz="4"/>
+          <w:insideV w:val="single" w:color="auto" w:sz="4"/>
+        </w:tblBorders>
+      </w:tblPr>
+      <w:tblGrid>
+        <w:gridCol w:w="9355"/>
+      </w:tblGrid>
+      <w:tr>
+        <w:trPr>
+          <w:trHeight w:val="4320" w:hRule="exact"/>
+        </w:trPr>
+        <w:tc>
+          <w:tcPr>
+            <w:tcW w:type="dxa" w:w="9355"/>
+            <w:tcBorders>
+              <w:top w:val="single" w:color="888888" w:sz="6"/>
+              <w:left w:val="single" w:color="888888" w:sz="6"/>
+              <w:bottom w:val="single" w:color="888888" w:sz="6"/>
+              <w:right w:val="single" w:color="888888" w:sz="6"/>
+            </w:tcBorders>
+            <w:shd w:fill="F2F2F2" w:val="clear"/>
+            <w:vAlign w:val="center"/>
+          </w:tcPr>
+          <w:p>
+            <w:pPr>
+              <w:jc w:val="center"/>
+            </w:pPr>
+            <w:r>
+              <w:rPr>
+                <w:rFonts w:ascii="Times New Roman" w:cs="Times New Roman" w:eastAsia="Times New Roman" w:hAnsi="Times New Roman"/>
+                <w:i/>
+                <w:iCs/>
+                <w:color w:val="888888"/>
+                <w:sz w:val="24"/>
+                <w:szCs w:val="24"/>
+              </w:rPr>
+              <w:t xml:space="preserve">[ Рисунок — вставить изображение ]</w:t>
+            </w:r>
+          </w:p>
+        </w:tc>
+      </w:tr>
+    </w:tbl>
+    <w:p>
+      <w:pPr>
+        <w:spacing w:after="160" w:before="80" w:line="360"/>
+        <w:jc w:val="center"/>
+      </w:pPr>
+      <w:r>
+        <w:rPr>
+          <w:rFonts w:ascii="Times New Roman" w:cs="Times New Roman" w:eastAsia="Times New Roman" w:hAnsi="Times New Roman"/>
+          <w:i/>
+          <w:iCs/>
+          <w:sz w:val="28"/>
+          <w:szCs w:val="28"/>
+        </w:rPr>
+        <w:t xml:space="preserve">Рисунок 7 — Пример успешной локализации OpenCV, тест 42 (IoU &gt; 0,98)</w:t>
+      </w:r>
+    </w:p>
+    <w:tbl>
+      <w:tblPr>
+        <w:tblW w:type="dxa" w:w="9355"/>
+        <w:tblBorders>
+          <w:top w:val="single" w:color="auto" w:sz="4"/>
+          <w:left w:val="single" w:color="auto" w:sz="4"/>
+          <w:bottom w:val="single" w:color="auto" w:sz="4"/>
+          <w:right w:val="single" w:color="auto" w:sz="4"/>
+          <w:insideH w:val="single" w:color="auto" w:sz="4"/>
+          <w:insideV w:val="single" w:color="auto" w:sz="4"/>
+        </w:tblBorders>
+      </w:tblPr>
+      <w:tblGrid>
+        <w:gridCol w:w="9355"/>
+      </w:tblGrid>
+      <w:tr>
+        <w:trPr>
+          <w:trHeight w:val="4320" w:hRule="exact"/>
+        </w:trPr>
+        <w:tc>
+          <w:tcPr>
+            <w:tcW w:type="dxa" w:w="9355"/>
+            <w:tcBorders>
+              <w:top w:val="single" w:color="888888" w:sz="6"/>
+              <w:left w:val="single" w:color="888888" w:sz="6"/>
+              <w:bottom w:val="single" w:color="888888" w:sz="6"/>
+              <w:right w:val="single" w:color="888888" w:sz="6"/>
+            </w:tcBorders>
+            <w:shd w:fill="F2F2F2" w:val="clear"/>
+            <w:vAlign w:val="center"/>
+          </w:tcPr>
+          <w:p>
+            <w:pPr>
+              <w:jc w:val="center"/>
+            </w:pPr>
+            <w:r>
+              <w:rPr>
+                <w:rFonts w:ascii="Times New Roman" w:cs="Times New Roman" w:eastAsia="Times New Roman" w:hAnsi="Times New Roman"/>
+                <w:i/>
+                <w:iCs/>
+                <w:color w:val="888888"/>
+                <w:sz w:val="24"/>
+                <w:szCs w:val="24"/>
+              </w:rPr>
+              <w:t xml:space="preserve">[ Рисунок — вставить изображение ]</w:t>
+            </w:r>
+          </w:p>
+        </w:tc>
+      </w:tr>
+    </w:tbl>
+    <w:p>
+      <w:pPr>
+        <w:spacing w:after="160" w:before="80" w:line="360"/>
+        <w:jc w:val="center"/>
+      </w:pPr>
+      <w:r>
+        <w:rPr>
+          <w:rFonts w:ascii="Times New Roman" w:cs="Times New Roman" w:eastAsia="Times New Roman" w:hAnsi="Times New Roman"/>
+          <w:i/>
+          <w:iCs/>
+          <w:sz w:val="28"/>
+          <w:szCs w:val="28"/>
+        </w:rPr>
+        <w:t xml:space="preserve">Рисунок 8 — Пример успешной локализации OpenCV, тест 43 (IoU &gt; 0,98)</w:t>
+      </w:r>
+    </w:p>
+    <w:tbl>
+      <w:tblPr>
+        <w:tblW w:type="dxa" w:w="9355"/>
+        <w:tblBorders>
+          <w:top w:val="single" w:color="auto" w:sz="4"/>
+          <w:left w:val="single" w:color="auto" w:sz="4"/>
+          <w:bottom w:val="single" w:color="auto" w:sz="4"/>
+          <w:right w:val="single" w:color="auto" w:sz="4"/>
+          <w:insideH w:val="single" w:color="auto" w:sz="4"/>
+          <w:insideV w:val="single" w:color="auto" w:sz="4"/>
+        </w:tblBorders>
+      </w:tblPr>
+      <w:tblGrid>
+        <w:gridCol w:w="9355"/>
+      </w:tblGrid>
+      <w:tr>
+        <w:trPr>
+          <w:trHeight w:val="4320" w:hRule="exact"/>
+        </w:trPr>
+        <w:tc>
+          <w:tcPr>
+            <w:tcW w:type="dxa" w:w="9355"/>
+            <w:tcBorders>
+              <w:top w:val="single" w:color="888888" w:sz="6"/>
+              <w:left w:val="single" w:color="888888" w:sz="6"/>
+              <w:bottom w:val="single" w:color="888888" w:sz="6"/>
+              <w:right w:val="single" w:color="888888" w:sz="6"/>
+            </w:tcBorders>
+            <w:shd w:fill="F2F2F2" w:val="clear"/>
+            <w:vAlign w:val="center"/>
+          </w:tcPr>
+          <w:p>
+            <w:pPr>
+              <w:jc w:val="center"/>
+            </w:pPr>
+            <w:r>
+              <w:rPr>
+                <w:rFonts w:ascii="Times New Roman" w:cs="Times New Roman" w:eastAsia="Times New Roman" w:hAnsi="Times New Roman"/>
+                <w:i/>
+                <w:iCs/>
+                <w:color w:val="888888"/>
+                <w:sz w:val="24"/>
+                <w:szCs w:val="24"/>
+              </w:rPr>
+              <w:t xml:space="preserve">[ Рисунок — вставить изображение ]</w:t>
+            </w:r>
+          </w:p>
+        </w:tc>
+      </w:tr>
+    </w:tbl>
+    <w:p>
+      <w:pPr>
+        <w:spacing w:after="160" w:before="80" w:line="360"/>
+        <w:jc w:val="center"/>
+      </w:pPr>
+      <w:r>
+        <w:rPr>
+          <w:rFonts w:ascii="Times New Roman" w:cs="Times New Roman" w:eastAsia="Times New Roman" w:hAnsi="Times New Roman"/>
+          <w:i/>
+          <w:iCs/>
+          <w:sz w:val="28"/>
+          <w:szCs w:val="28"/>
+        </w:rPr>
+        <w:t xml:space="preserve">Рисунок 9 — Пример успешной локализации OpenCV, тест 47 (IoU &gt; 0,98)</w:t>
+      </w:r>
+    </w:p>
+    <w:p>
+      <w:pPr>
+        <w:spacing w:after="0" w:before="0" w:line="360"/>
+      </w:pPr>
+      <w:r>
+        <w:rPr>
+          <w:rFonts w:ascii="Times New Roman" w:cs="Times New Roman" w:eastAsia="Times New Roman" w:hAnsi="Times New Roman"/>
+          <w:sz w:val="28"/>
+          <w:szCs w:val="28"/>
+        </w:rPr>
+        <w:t xml:space="preserve"/>
+      </w:r>
+    </w:p>
+    <w:p>
+      <w:pPr>
         <w:pStyle w:val="Heading2"/>
         <w:spacing w:after="80" w:before="200" w:line="360"/>
         <w:jc w:val="left"/>
@@ -1826,6 +2502,748 @@
           <w:szCs w:val="28"/>
         </w:rPr>
         <w:t xml:space="preserve">Случаи с нулевым IoU у метода OpenCV (11 изображений) связаны с несовпадением автоматически определённой ОИ и фактического расположения основной надписи (нестандартное размещение штампа) либо с некорректным определением разрешения изображения. Доля чертежей с нестандартным расположением штампа в тестовой выборке составила около 19 % (9 из 48 оцениваемых изображений).</w:t>
+      </w:r>
+    </w:p>
+    <w:p>
+      <w:pPr>
+        <w:spacing w:after="0" w:before="0" w:line="360"/>
+      </w:pPr>
+      <w:r>
+        <w:rPr>
+          <w:rFonts w:ascii="Times New Roman" w:cs="Times New Roman" w:eastAsia="Times New Roman" w:hAnsi="Times New Roman"/>
+          <w:sz w:val="28"/>
+          <w:szCs w:val="28"/>
+        </w:rPr>
+        <w:t xml:space="preserve"/>
+      </w:r>
+    </w:p>
+    <w:p>
+      <w:pPr>
+        <w:spacing w:after="0" w:before="0" w:line="360"/>
+        <w:ind w:firstLine="709"/>
+        <w:jc w:val="both"/>
+      </w:pPr>
+      <w:r>
+        <w:rPr>
+          <w:rFonts w:ascii="Times New Roman" w:cs="Times New Roman" w:eastAsia="Times New Roman" w:hAnsi="Times New Roman"/>
+          <w:sz w:val="28"/>
+          <w:szCs w:val="28"/>
+        </w:rPr>
+        <w:t xml:space="preserve">На рисунках 10–14 приведены характерные примеры ошибок метода YOLOv8: модель детектирует вспомогательные штампы в верхней части листа вместо основной надписи внизу.</w:t>
+      </w:r>
+    </w:p>
+    <w:p>
+      <w:pPr>
+        <w:spacing w:after="0" w:before="0" w:line="360"/>
+      </w:pPr>
+      <w:r>
+        <w:rPr>
+          <w:rFonts w:ascii="Times New Roman" w:cs="Times New Roman" w:eastAsia="Times New Roman" w:hAnsi="Times New Roman"/>
+          <w:sz w:val="28"/>
+          <w:szCs w:val="28"/>
+        </w:rPr>
+        <w:t xml:space="preserve"/>
+      </w:r>
+    </w:p>
+    <w:tbl>
+      <w:tblPr>
+        <w:tblW w:type="dxa" w:w="9355"/>
+        <w:tblBorders>
+          <w:top w:val="single" w:color="auto" w:sz="4"/>
+          <w:left w:val="single" w:color="auto" w:sz="4"/>
+          <w:bottom w:val="single" w:color="auto" w:sz="4"/>
+          <w:right w:val="single" w:color="auto" w:sz="4"/>
+          <w:insideH w:val="single" w:color="auto" w:sz="4"/>
+          <w:insideV w:val="single" w:color="auto" w:sz="4"/>
+        </w:tblBorders>
+      </w:tblPr>
+      <w:tblGrid>
+        <w:gridCol w:w="9355"/>
+      </w:tblGrid>
+      <w:tr>
+        <w:trPr>
+          <w:trHeight w:val="4320" w:hRule="exact"/>
+        </w:trPr>
+        <w:tc>
+          <w:tcPr>
+            <w:tcW w:type="dxa" w:w="9355"/>
+            <w:tcBorders>
+              <w:top w:val="single" w:color="888888" w:sz="6"/>
+              <w:left w:val="single" w:color="888888" w:sz="6"/>
+              <w:bottom w:val="single" w:color="888888" w:sz="6"/>
+              <w:right w:val="single" w:color="888888" w:sz="6"/>
+            </w:tcBorders>
+            <w:shd w:fill="F2F2F2" w:val="clear"/>
+            <w:vAlign w:val="center"/>
+          </w:tcPr>
+          <w:p>
+            <w:pPr>
+              <w:jc w:val="center"/>
+            </w:pPr>
+            <w:r>
+              <w:rPr>
+                <w:rFonts w:ascii="Times New Roman" w:cs="Times New Roman" w:eastAsia="Times New Roman" w:hAnsi="Times New Roman"/>
+                <w:i/>
+                <w:iCs/>
+                <w:color w:val="888888"/>
+                <w:sz w:val="24"/>
+                <w:szCs w:val="24"/>
+              </w:rPr>
+              <w:t xml:space="preserve">[ Рисунок — вставить изображение ]</w:t>
+            </w:r>
+          </w:p>
+        </w:tc>
+      </w:tr>
+    </w:tbl>
+    <w:p>
+      <w:pPr>
+        <w:spacing w:after="160" w:before="80" w:line="360"/>
+        <w:jc w:val="center"/>
+      </w:pPr>
+      <w:r>
+        <w:rPr>
+          <w:rFonts w:ascii="Times New Roman" w:cs="Times New Roman" w:eastAsia="Times New Roman" w:hAnsi="Times New Roman"/>
+          <w:i/>
+          <w:iCs/>
+          <w:sz w:val="28"/>
+          <w:szCs w:val="28"/>
+        </w:rPr>
+        <w:t xml:space="preserve">Рисунок 10 — Ошибка YOLOv8: детекция вспомогательного штампа, тест 07</w:t>
+      </w:r>
+    </w:p>
+    <w:tbl>
+      <w:tblPr>
+        <w:tblW w:type="dxa" w:w="9355"/>
+        <w:tblBorders>
+          <w:top w:val="single" w:color="auto" w:sz="4"/>
+          <w:left w:val="single" w:color="auto" w:sz="4"/>
+          <w:bottom w:val="single" w:color="auto" w:sz="4"/>
+          <w:right w:val="single" w:color="auto" w:sz="4"/>
+          <w:insideH w:val="single" w:color="auto" w:sz="4"/>
+          <w:insideV w:val="single" w:color="auto" w:sz="4"/>
+        </w:tblBorders>
+      </w:tblPr>
+      <w:tblGrid>
+        <w:gridCol w:w="9355"/>
+      </w:tblGrid>
+      <w:tr>
+        <w:trPr>
+          <w:trHeight w:val="4320" w:hRule="exact"/>
+        </w:trPr>
+        <w:tc>
+          <w:tcPr>
+            <w:tcW w:type="dxa" w:w="9355"/>
+            <w:tcBorders>
+              <w:top w:val="single" w:color="888888" w:sz="6"/>
+              <w:left w:val="single" w:color="888888" w:sz="6"/>
+              <w:bottom w:val="single" w:color="888888" w:sz="6"/>
+              <w:right w:val="single" w:color="888888" w:sz="6"/>
+            </w:tcBorders>
+            <w:shd w:fill="F2F2F2" w:val="clear"/>
+            <w:vAlign w:val="center"/>
+          </w:tcPr>
+          <w:p>
+            <w:pPr>
+              <w:jc w:val="center"/>
+            </w:pPr>
+            <w:r>
+              <w:rPr>
+                <w:rFonts w:ascii="Times New Roman" w:cs="Times New Roman" w:eastAsia="Times New Roman" w:hAnsi="Times New Roman"/>
+                <w:i/>
+                <w:iCs/>
+                <w:color w:val="888888"/>
+                <w:sz w:val="24"/>
+                <w:szCs w:val="24"/>
+              </w:rPr>
+              <w:t xml:space="preserve">[ Рисунок — вставить изображение ]</w:t>
+            </w:r>
+          </w:p>
+        </w:tc>
+      </w:tr>
+    </w:tbl>
+    <w:p>
+      <w:pPr>
+        <w:spacing w:after="160" w:before="80" w:line="360"/>
+        <w:jc w:val="center"/>
+      </w:pPr>
+      <w:r>
+        <w:rPr>
+          <w:rFonts w:ascii="Times New Roman" w:cs="Times New Roman" w:eastAsia="Times New Roman" w:hAnsi="Times New Roman"/>
+          <w:i/>
+          <w:iCs/>
+          <w:sz w:val="28"/>
+          <w:szCs w:val="28"/>
+        </w:rPr>
+        <w:t xml:space="preserve">Рисунок 11 — Ошибка YOLOv8: детекция вспомогательного штампа, тест 14</w:t>
+      </w:r>
+    </w:p>
+    <w:tbl>
+      <w:tblPr>
+        <w:tblW w:type="dxa" w:w="9355"/>
+        <w:tblBorders>
+          <w:top w:val="single" w:color="auto" w:sz="4"/>
+          <w:left w:val="single" w:color="auto" w:sz="4"/>
+          <w:bottom w:val="single" w:color="auto" w:sz="4"/>
+          <w:right w:val="single" w:color="auto" w:sz="4"/>
+          <w:insideH w:val="single" w:color="auto" w:sz="4"/>
+          <w:insideV w:val="single" w:color="auto" w:sz="4"/>
+        </w:tblBorders>
+      </w:tblPr>
+      <w:tblGrid>
+        <w:gridCol w:w="9355"/>
+      </w:tblGrid>
+      <w:tr>
+        <w:trPr>
+          <w:trHeight w:val="4320" w:hRule="exact"/>
+        </w:trPr>
+        <w:tc>
+          <w:tcPr>
+            <w:tcW w:type="dxa" w:w="9355"/>
+            <w:tcBorders>
+              <w:top w:val="single" w:color="888888" w:sz="6"/>
+              <w:left w:val="single" w:color="888888" w:sz="6"/>
+              <w:bottom w:val="single" w:color="888888" w:sz="6"/>
+              <w:right w:val="single" w:color="888888" w:sz="6"/>
+            </w:tcBorders>
+            <w:shd w:fill="F2F2F2" w:val="clear"/>
+            <w:vAlign w:val="center"/>
+          </w:tcPr>
+          <w:p>
+            <w:pPr>
+              <w:jc w:val="center"/>
+            </w:pPr>
+            <w:r>
+              <w:rPr>
+                <w:rFonts w:ascii="Times New Roman" w:cs="Times New Roman" w:eastAsia="Times New Roman" w:hAnsi="Times New Roman"/>
+                <w:i/>
+                <w:iCs/>
+                <w:color w:val="888888"/>
+                <w:sz w:val="24"/>
+                <w:szCs w:val="24"/>
+              </w:rPr>
+              <w:t xml:space="preserve">[ Рисунок — вставить изображение ]</w:t>
+            </w:r>
+          </w:p>
+        </w:tc>
+      </w:tr>
+    </w:tbl>
+    <w:p>
+      <w:pPr>
+        <w:spacing w:after="160" w:before="80" w:line="360"/>
+        <w:jc w:val="center"/>
+      </w:pPr>
+      <w:r>
+        <w:rPr>
+          <w:rFonts w:ascii="Times New Roman" w:cs="Times New Roman" w:eastAsia="Times New Roman" w:hAnsi="Times New Roman"/>
+          <w:i/>
+          <w:iCs/>
+          <w:sz w:val="28"/>
+          <w:szCs w:val="28"/>
+        </w:rPr>
+        <w:t xml:space="preserve">Рисунок 12 — Ошибка YOLOv8: детекция вспомогательного штампа, тест 19</w:t>
+      </w:r>
+    </w:p>
+    <w:tbl>
+      <w:tblPr>
+        <w:tblW w:type="dxa" w:w="9355"/>
+        <w:tblBorders>
+          <w:top w:val="single" w:color="auto" w:sz="4"/>
+          <w:left w:val="single" w:color="auto" w:sz="4"/>
+          <w:bottom w:val="single" w:color="auto" w:sz="4"/>
+          <w:right w:val="single" w:color="auto" w:sz="4"/>
+          <w:insideH w:val="single" w:color="auto" w:sz="4"/>
+          <w:insideV w:val="single" w:color="auto" w:sz="4"/>
+        </w:tblBorders>
+      </w:tblPr>
+      <w:tblGrid>
+        <w:gridCol w:w="9355"/>
+      </w:tblGrid>
+      <w:tr>
+        <w:trPr>
+          <w:trHeight w:val="4320" w:hRule="exact"/>
+        </w:trPr>
+        <w:tc>
+          <w:tcPr>
+            <w:tcW w:type="dxa" w:w="9355"/>
+            <w:tcBorders>
+              <w:top w:val="single" w:color="888888" w:sz="6"/>
+              <w:left w:val="single" w:color="888888" w:sz="6"/>
+              <w:bottom w:val="single" w:color="888888" w:sz="6"/>
+              <w:right w:val="single" w:color="888888" w:sz="6"/>
+            </w:tcBorders>
+            <w:shd w:fill="F2F2F2" w:val="clear"/>
+            <w:vAlign w:val="center"/>
+          </w:tcPr>
+          <w:p>
+            <w:pPr>
+              <w:jc w:val="center"/>
+            </w:pPr>
+            <w:r>
+              <w:rPr>
+                <w:rFonts w:ascii="Times New Roman" w:cs="Times New Roman" w:eastAsia="Times New Roman" w:hAnsi="Times New Roman"/>
+                <w:i/>
+                <w:iCs/>
+                <w:color w:val="888888"/>
+                <w:sz w:val="24"/>
+                <w:szCs w:val="24"/>
+              </w:rPr>
+              <w:t xml:space="preserve">[ Рисунок — вставить изображение ]</w:t>
+            </w:r>
+          </w:p>
+        </w:tc>
+      </w:tr>
+    </w:tbl>
+    <w:p>
+      <w:pPr>
+        <w:spacing w:after="160" w:before="80" w:line="360"/>
+        <w:jc w:val="center"/>
+      </w:pPr>
+      <w:r>
+        <w:rPr>
+          <w:rFonts w:ascii="Times New Roman" w:cs="Times New Roman" w:eastAsia="Times New Roman" w:hAnsi="Times New Roman"/>
+          <w:i/>
+          <w:iCs/>
+          <w:sz w:val="28"/>
+          <w:szCs w:val="28"/>
+        </w:rPr>
+        <w:t xml:space="preserve">Рисунок 13 — Ошибка YOLOv8: детекция вспомогательного штампа, тест 23</w:t>
+      </w:r>
+    </w:p>
+    <w:tbl>
+      <w:tblPr>
+        <w:tblW w:type="dxa" w:w="9355"/>
+        <w:tblBorders>
+          <w:top w:val="single" w:color="auto" w:sz="4"/>
+          <w:left w:val="single" w:color="auto" w:sz="4"/>
+          <w:bottom w:val="single" w:color="auto" w:sz="4"/>
+          <w:right w:val="single" w:color="auto" w:sz="4"/>
+          <w:insideH w:val="single" w:color="auto" w:sz="4"/>
+          <w:insideV w:val="single" w:color="auto" w:sz="4"/>
+        </w:tblBorders>
+      </w:tblPr>
+      <w:tblGrid>
+        <w:gridCol w:w="9355"/>
+      </w:tblGrid>
+      <w:tr>
+        <w:trPr>
+          <w:trHeight w:val="4320" w:hRule="exact"/>
+        </w:trPr>
+        <w:tc>
+          <w:tcPr>
+            <w:tcW w:type="dxa" w:w="9355"/>
+            <w:tcBorders>
+              <w:top w:val="single" w:color="888888" w:sz="6"/>
+              <w:left w:val="single" w:color="888888" w:sz="6"/>
+              <w:bottom w:val="single" w:color="888888" w:sz="6"/>
+              <w:right w:val="single" w:color="888888" w:sz="6"/>
+            </w:tcBorders>
+            <w:shd w:fill="F2F2F2" w:val="clear"/>
+            <w:vAlign w:val="center"/>
+          </w:tcPr>
+          <w:p>
+            <w:pPr>
+              <w:jc w:val="center"/>
+            </w:pPr>
+            <w:r>
+              <w:rPr>
+                <w:rFonts w:ascii="Times New Roman" w:cs="Times New Roman" w:eastAsia="Times New Roman" w:hAnsi="Times New Roman"/>
+                <w:i/>
+                <w:iCs/>
+                <w:color w:val="888888"/>
+                <w:sz w:val="24"/>
+                <w:szCs w:val="24"/>
+              </w:rPr>
+              <w:t xml:space="preserve">[ Рисунок — вставить изображение ]</w:t>
+            </w:r>
+          </w:p>
+        </w:tc>
+      </w:tr>
+    </w:tbl>
+    <w:p>
+      <w:pPr>
+        <w:spacing w:after="160" w:before="80" w:line="360"/>
+        <w:jc w:val="center"/>
+      </w:pPr>
+      <w:r>
+        <w:rPr>
+          <w:rFonts w:ascii="Times New Roman" w:cs="Times New Roman" w:eastAsia="Times New Roman" w:hAnsi="Times New Roman"/>
+          <w:i/>
+          <w:iCs/>
+          <w:sz w:val="28"/>
+          <w:szCs w:val="28"/>
+        </w:rPr>
+        <w:t xml:space="preserve">Рисунок 14 — Ошибка YOLOv8: детекция вспомогательного штампа, тест 30</w:t>
+      </w:r>
+    </w:p>
+    <w:p>
+      <w:pPr>
+        <w:spacing w:after="0" w:before="0" w:line="360"/>
+      </w:pPr>
+      <w:r>
+        <w:rPr>
+          <w:rFonts w:ascii="Times New Roman" w:cs="Times New Roman" w:eastAsia="Times New Roman" w:hAnsi="Times New Roman"/>
+          <w:sz w:val="28"/>
+          <w:szCs w:val="28"/>
+        </w:rPr>
+        <w:t xml:space="preserve"/>
+      </w:r>
+    </w:p>
+    <w:p>
+      <w:pPr>
+        <w:spacing w:after="0" w:before="0" w:line="360"/>
+        <w:ind w:firstLine="709"/>
+        <w:jc w:val="both"/>
+      </w:pPr>
+      <w:r>
+        <w:rPr>
+          <w:rFonts w:ascii="Times New Roman" w:cs="Times New Roman" w:eastAsia="Times New Roman" w:hAnsi="Times New Roman"/>
+          <w:sz w:val="28"/>
+          <w:szCs w:val="28"/>
+        </w:rPr>
+        <w:t xml:space="preserve">На рисунках 15–19 приведены характерные примеры ошибок метода OpenCV: область интереса не совпадает с фактическим расположением штампа.</w:t>
+      </w:r>
+    </w:p>
+    <w:p>
+      <w:pPr>
+        <w:spacing w:after="0" w:before="0" w:line="360"/>
+      </w:pPr>
+      <w:r>
+        <w:rPr>
+          <w:rFonts w:ascii="Times New Roman" w:cs="Times New Roman" w:eastAsia="Times New Roman" w:hAnsi="Times New Roman"/>
+          <w:sz w:val="28"/>
+          <w:szCs w:val="28"/>
+        </w:rPr>
+        <w:t xml:space="preserve"/>
+      </w:r>
+    </w:p>
+    <w:tbl>
+      <w:tblPr>
+        <w:tblW w:type="dxa" w:w="9355"/>
+        <w:tblBorders>
+          <w:top w:val="single" w:color="auto" w:sz="4"/>
+          <w:left w:val="single" w:color="auto" w:sz="4"/>
+          <w:bottom w:val="single" w:color="auto" w:sz="4"/>
+          <w:right w:val="single" w:color="auto" w:sz="4"/>
+          <w:insideH w:val="single" w:color="auto" w:sz="4"/>
+          <w:insideV w:val="single" w:color="auto" w:sz="4"/>
+        </w:tblBorders>
+      </w:tblPr>
+      <w:tblGrid>
+        <w:gridCol w:w="9355"/>
+      </w:tblGrid>
+      <w:tr>
+        <w:trPr>
+          <w:trHeight w:val="4320" w:hRule="exact"/>
+        </w:trPr>
+        <w:tc>
+          <w:tcPr>
+            <w:tcW w:type="dxa" w:w="9355"/>
+            <w:tcBorders>
+              <w:top w:val="single" w:color="888888" w:sz="6"/>
+              <w:left w:val="single" w:color="888888" w:sz="6"/>
+              <w:bottom w:val="single" w:color="888888" w:sz="6"/>
+              <w:right w:val="single" w:color="888888" w:sz="6"/>
+            </w:tcBorders>
+            <w:shd w:fill="F2F2F2" w:val="clear"/>
+            <w:vAlign w:val="center"/>
+          </w:tcPr>
+          <w:p>
+            <w:pPr>
+              <w:jc w:val="center"/>
+            </w:pPr>
+            <w:r>
+              <w:rPr>
+                <w:rFonts w:ascii="Times New Roman" w:cs="Times New Roman" w:eastAsia="Times New Roman" w:hAnsi="Times New Roman"/>
+                <w:i/>
+                <w:iCs/>
+                <w:color w:val="888888"/>
+                <w:sz w:val="24"/>
+                <w:szCs w:val="24"/>
+              </w:rPr>
+              <w:t xml:space="preserve">[ Рисунок — вставить изображение ]</w:t>
+            </w:r>
+          </w:p>
+        </w:tc>
+      </w:tr>
+    </w:tbl>
+    <w:p>
+      <w:pPr>
+        <w:spacing w:after="160" w:before="80" w:line="360"/>
+        <w:jc w:val="center"/>
+      </w:pPr>
+      <w:r>
+        <w:rPr>
+          <w:rFonts w:ascii="Times New Roman" w:cs="Times New Roman" w:eastAsia="Times New Roman" w:hAnsi="Times New Roman"/>
+          <w:i/>
+          <w:iCs/>
+          <w:sz w:val="28"/>
+          <w:szCs w:val="28"/>
+        </w:rPr>
+        <w:t xml:space="preserve">Рисунок 15 — Ошибка OpenCV: несовпадение области интереса, тест 02</w:t>
+      </w:r>
+    </w:p>
+    <w:tbl>
+      <w:tblPr>
+        <w:tblW w:type="dxa" w:w="9355"/>
+        <w:tblBorders>
+          <w:top w:val="single" w:color="auto" w:sz="4"/>
+          <w:left w:val="single" w:color="auto" w:sz="4"/>
+          <w:bottom w:val="single" w:color="auto" w:sz="4"/>
+          <w:right w:val="single" w:color="auto" w:sz="4"/>
+          <w:insideH w:val="single" w:color="auto" w:sz="4"/>
+          <w:insideV w:val="single" w:color="auto" w:sz="4"/>
+        </w:tblBorders>
+      </w:tblPr>
+      <w:tblGrid>
+        <w:gridCol w:w="9355"/>
+      </w:tblGrid>
+      <w:tr>
+        <w:trPr>
+          <w:trHeight w:val="4320" w:hRule="exact"/>
+        </w:trPr>
+        <w:tc>
+          <w:tcPr>
+            <w:tcW w:type="dxa" w:w="9355"/>
+            <w:tcBorders>
+              <w:top w:val="single" w:color="888888" w:sz="6"/>
+              <w:left w:val="single" w:color="888888" w:sz="6"/>
+              <w:bottom w:val="single" w:color="888888" w:sz="6"/>
+              <w:right w:val="single" w:color="888888" w:sz="6"/>
+            </w:tcBorders>
+            <w:shd w:fill="F2F2F2" w:val="clear"/>
+            <w:vAlign w:val="center"/>
+          </w:tcPr>
+          <w:p>
+            <w:pPr>
+              <w:jc w:val="center"/>
+            </w:pPr>
+            <w:r>
+              <w:rPr>
+                <w:rFonts w:ascii="Times New Roman" w:cs="Times New Roman" w:eastAsia="Times New Roman" w:hAnsi="Times New Roman"/>
+                <w:i/>
+                <w:iCs/>
+                <w:color w:val="888888"/>
+                <w:sz w:val="24"/>
+                <w:szCs w:val="24"/>
+              </w:rPr>
+              <w:t xml:space="preserve">[ Рисунок — вставить изображение ]</w:t>
+            </w:r>
+          </w:p>
+        </w:tc>
+      </w:tr>
+    </w:tbl>
+    <w:p>
+      <w:pPr>
+        <w:spacing w:after="160" w:before="80" w:line="360"/>
+        <w:jc w:val="center"/>
+      </w:pPr>
+      <w:r>
+        <w:rPr>
+          <w:rFonts w:ascii="Times New Roman" w:cs="Times New Roman" w:eastAsia="Times New Roman" w:hAnsi="Times New Roman"/>
+          <w:i/>
+          <w:iCs/>
+          <w:sz w:val="28"/>
+          <w:szCs w:val="28"/>
+        </w:rPr>
+        <w:t xml:space="preserve">Рисунок 16 — Ошибка OpenCV: несовпадение области интереса, тест 19</w:t>
+      </w:r>
+    </w:p>
+    <w:tbl>
+      <w:tblPr>
+        <w:tblW w:type="dxa" w:w="9355"/>
+        <w:tblBorders>
+          <w:top w:val="single" w:color="auto" w:sz="4"/>
+          <w:left w:val="single" w:color="auto" w:sz="4"/>
+          <w:bottom w:val="single" w:color="auto" w:sz="4"/>
+          <w:right w:val="single" w:color="auto" w:sz="4"/>
+          <w:insideH w:val="single" w:color="auto" w:sz="4"/>
+          <w:insideV w:val="single" w:color="auto" w:sz="4"/>
+        </w:tblBorders>
+      </w:tblPr>
+      <w:tblGrid>
+        <w:gridCol w:w="9355"/>
+      </w:tblGrid>
+      <w:tr>
+        <w:trPr>
+          <w:trHeight w:val="4320" w:hRule="exact"/>
+        </w:trPr>
+        <w:tc>
+          <w:tcPr>
+            <w:tcW w:type="dxa" w:w="9355"/>
+            <w:tcBorders>
+              <w:top w:val="single" w:color="888888" w:sz="6"/>
+              <w:left w:val="single" w:color="888888" w:sz="6"/>
+              <w:bottom w:val="single" w:color="888888" w:sz="6"/>
+              <w:right w:val="single" w:color="888888" w:sz="6"/>
+            </w:tcBorders>
+            <w:shd w:fill="F2F2F2" w:val="clear"/>
+            <w:vAlign w:val="center"/>
+          </w:tcPr>
+          <w:p>
+            <w:pPr>
+              <w:jc w:val="center"/>
+            </w:pPr>
+            <w:r>
+              <w:rPr>
+                <w:rFonts w:ascii="Times New Roman" w:cs="Times New Roman" w:eastAsia="Times New Roman" w:hAnsi="Times New Roman"/>
+                <w:i/>
+                <w:iCs/>
+                <w:color w:val="888888"/>
+                <w:sz w:val="24"/>
+                <w:szCs w:val="24"/>
+              </w:rPr>
+              <w:t xml:space="preserve">[ Рисунок — вставить изображение ]</w:t>
+            </w:r>
+          </w:p>
+        </w:tc>
+      </w:tr>
+    </w:tbl>
+    <w:p>
+      <w:pPr>
+        <w:spacing w:after="160" w:before="80" w:line="360"/>
+        <w:jc w:val="center"/>
+      </w:pPr>
+      <w:r>
+        <w:rPr>
+          <w:rFonts w:ascii="Times New Roman" w:cs="Times New Roman" w:eastAsia="Times New Roman" w:hAnsi="Times New Roman"/>
+          <w:i/>
+          <w:iCs/>
+          <w:sz w:val="28"/>
+          <w:szCs w:val="28"/>
+        </w:rPr>
+        <w:t xml:space="preserve">Рисунок 17 — Ошибка OpenCV: несовпадение области интереса, тест 20</w:t>
+      </w:r>
+    </w:p>
+    <w:tbl>
+      <w:tblPr>
+        <w:tblW w:type="dxa" w:w="9355"/>
+        <w:tblBorders>
+          <w:top w:val="single" w:color="auto" w:sz="4"/>
+          <w:left w:val="single" w:color="auto" w:sz="4"/>
+          <w:bottom w:val="single" w:color="auto" w:sz="4"/>
+          <w:right w:val="single" w:color="auto" w:sz="4"/>
+          <w:insideH w:val="single" w:color="auto" w:sz="4"/>
+          <w:insideV w:val="single" w:color="auto" w:sz="4"/>
+        </w:tblBorders>
+      </w:tblPr>
+      <w:tblGrid>
+        <w:gridCol w:w="9355"/>
+      </w:tblGrid>
+      <w:tr>
+        <w:trPr>
+          <w:trHeight w:val="4320" w:hRule="exact"/>
+        </w:trPr>
+        <w:tc>
+          <w:tcPr>
+            <w:tcW w:type="dxa" w:w="9355"/>
+            <w:tcBorders>
+              <w:top w:val="single" w:color="888888" w:sz="6"/>
+              <w:left w:val="single" w:color="888888" w:sz="6"/>
+              <w:bottom w:val="single" w:color="888888" w:sz="6"/>
+              <w:right w:val="single" w:color="888888" w:sz="6"/>
+            </w:tcBorders>
+            <w:shd w:fill="F2F2F2" w:val="clear"/>
+            <w:vAlign w:val="center"/>
+          </w:tcPr>
+          <w:p>
+            <w:pPr>
+              <w:jc w:val="center"/>
+            </w:pPr>
+            <w:r>
+              <w:rPr>
+                <w:rFonts w:ascii="Times New Roman" w:cs="Times New Roman" w:eastAsia="Times New Roman" w:hAnsi="Times New Roman"/>
+                <w:i/>
+                <w:iCs/>
+                <w:color w:val="888888"/>
+                <w:sz w:val="24"/>
+                <w:szCs w:val="24"/>
+              </w:rPr>
+              <w:t xml:space="preserve">[ Рисунок — вставить изображение ]</w:t>
+            </w:r>
+          </w:p>
+        </w:tc>
+      </w:tr>
+    </w:tbl>
+    <w:p>
+      <w:pPr>
+        <w:spacing w:after="160" w:before="80" w:line="360"/>
+        <w:jc w:val="center"/>
+      </w:pPr>
+      <w:r>
+        <w:rPr>
+          <w:rFonts w:ascii="Times New Roman" w:cs="Times New Roman" w:eastAsia="Times New Roman" w:hAnsi="Times New Roman"/>
+          <w:i/>
+          <w:iCs/>
+          <w:sz w:val="28"/>
+          <w:szCs w:val="28"/>
+        </w:rPr>
+        <w:t xml:space="preserve">Рисунок 18 — Ошибка OpenCV: несовпадение области интереса, тест 22</w:t>
+      </w:r>
+    </w:p>
+    <w:tbl>
+      <w:tblPr>
+        <w:tblW w:type="dxa" w:w="9355"/>
+        <w:tblBorders>
+          <w:top w:val="single" w:color="auto" w:sz="4"/>
+          <w:left w:val="single" w:color="auto" w:sz="4"/>
+          <w:bottom w:val="single" w:color="auto" w:sz="4"/>
+          <w:right w:val="single" w:color="auto" w:sz="4"/>
+          <w:insideH w:val="single" w:color="auto" w:sz="4"/>
+          <w:insideV w:val="single" w:color="auto" w:sz="4"/>
+        </w:tblBorders>
+      </w:tblPr>
+      <w:tblGrid>
+        <w:gridCol w:w="9355"/>
+      </w:tblGrid>
+      <w:tr>
+        <w:trPr>
+          <w:trHeight w:val="4320" w:hRule="exact"/>
+        </w:trPr>
+        <w:tc>
+          <w:tcPr>
+            <w:tcW w:type="dxa" w:w="9355"/>
+            <w:tcBorders>
+              <w:top w:val="single" w:color="888888" w:sz="6"/>
+              <w:left w:val="single" w:color="888888" w:sz="6"/>
+              <w:bottom w:val="single" w:color="888888" w:sz="6"/>
+              <w:right w:val="single" w:color="888888" w:sz="6"/>
+            </w:tcBorders>
+            <w:shd w:fill="F2F2F2" w:val="clear"/>
+            <w:vAlign w:val="center"/>
+          </w:tcPr>
+          <w:p>
+            <w:pPr>
+              <w:jc w:val="center"/>
+            </w:pPr>
+            <w:r>
+              <w:rPr>
+                <w:rFonts w:ascii="Times New Roman" w:cs="Times New Roman" w:eastAsia="Times New Roman" w:hAnsi="Times New Roman"/>
+                <w:i/>
+                <w:iCs/>
+                <w:color w:val="888888"/>
+                <w:sz w:val="24"/>
+                <w:szCs w:val="24"/>
+              </w:rPr>
+              <w:t xml:space="preserve">[ Рисунок — вставить изображение ]</w:t>
+            </w:r>
+          </w:p>
+        </w:tc>
+      </w:tr>
+    </w:tbl>
+    <w:p>
+      <w:pPr>
+        <w:spacing w:after="160" w:before="80" w:line="360"/>
+        <w:jc w:val="center"/>
+      </w:pPr>
+      <w:r>
+        <w:rPr>
+          <w:rFonts w:ascii="Times New Roman" w:cs="Times New Roman" w:eastAsia="Times New Roman" w:hAnsi="Times New Roman"/>
+          <w:i/>
+          <w:iCs/>
+          <w:sz w:val="28"/>
+          <w:szCs w:val="28"/>
+        </w:rPr>
+        <w:t xml:space="preserve">Рисунок 19 — Ошибка OpenCV: несовпадение области интереса, тест 24</w:t>
       </w:r>
     </w:p>
     <w:p>
@@ -3444,7 +4862,7 @@
         </w:rPr>
         <w:t xml:space="preserve">Репозиторий проекта: </w:t>
       </w:r>
-      <w:hyperlink w:history="1" r:id="rId8hf4yze1ficuwy4u3kil2">
+      <w:hyperlink w:history="1" r:id="rId9ulefip7pekrgndhk_g56">
         <w:r>
           <w:rPr>
             <w:rStyle w:val="Hyperlink"/>

</xml_diff>